<commit_message>
lab_1 fixed, lab_2 added
</commit_message>
<xml_diff>
--- a/lab_1/report_01.docx
+++ b/lab_1/report_01.docx
@@ -12,7 +12,6 @@
           <w:szCs w:val="36"/>
         </w:rPr>
       </w:pPr>
-      <w:bookmarkStart w:id="0" w:name="_GoBack"/>
     </w:p>
     <w:p>
       <w:pPr>
@@ -201,7 +200,7 @@
       </w:r>
       <w:r>
         <w:rPr>
-          <w:lang w:val="en-US"/>
+          <w:lang w:val="ru-RU"/>
         </w:rPr>
         <w:t>.</w:t>
       </w:r>
@@ -213,7 +212,7 @@
       </w:r>
       <w:r>
         <w:rPr>
-          <w:lang w:val="en-US"/>
+          <w:lang w:val="ru-RU"/>
         </w:rPr>
         <w:t>.</w:t>
       </w:r>
@@ -287,8 +286,8 @@
       <w:pPr>
         <w:pStyle w:val="1"/>
       </w:pPr>
-      <w:bookmarkStart w:id="1" w:name="_k7m5any6zs8w" w:colFirst="0" w:colLast="0"/>
-      <w:bookmarkEnd w:id="1"/>
+      <w:bookmarkStart w:id="0" w:name="_k7m5any6zs8w" w:colFirst="0" w:colLast="0"/>
+      <w:bookmarkEnd w:id="0"/>
       <w:r>
         <w:lastRenderedPageBreak/>
         <w:t>Оглавление</w:t>
@@ -585,8 +584,8 @@
       <w:pPr>
         <w:pStyle w:val="1"/>
       </w:pPr>
-      <w:bookmarkStart w:id="2" w:name="_sg2pahau6opc" w:colFirst="0" w:colLast="0"/>
-      <w:bookmarkEnd w:id="2"/>
+      <w:bookmarkStart w:id="1" w:name="_sg2pahau6opc" w:colFirst="0" w:colLast="0"/>
+      <w:bookmarkEnd w:id="1"/>
       <w:r>
         <w:lastRenderedPageBreak/>
         <w:t>Цель работы</w:t>
@@ -619,8 +618,8 @@
         </w:pBdr>
         <w:spacing w:after="240" w:line="300" w:lineRule="auto"/>
       </w:pPr>
-      <w:bookmarkStart w:id="3" w:name="_7f75l6l4rtoj" w:colFirst="0" w:colLast="0"/>
-      <w:bookmarkEnd w:id="3"/>
+      <w:bookmarkStart w:id="2" w:name="_7f75l6l4rtoj" w:colFirst="0" w:colLast="0"/>
+      <w:bookmarkEnd w:id="2"/>
       <w:r>
         <w:t>Исследуемое программное обеспечение и среда выполнения</w:t>
       </w:r>
@@ -641,16 +640,47 @@
         <w:rPr>
           <w:sz w:val="28"/>
           <w:szCs w:val="28"/>
-          <w:lang w:val="ru"/>
         </w:rPr>
       </w:pPr>
       <w:r>
         <w:rPr>
           <w:sz w:val="28"/>
           <w:szCs w:val="28"/>
-          <w:lang w:val="ru"/>
-        </w:rPr>
-        <w:t>Специально разработанное приложение на языке C (исходный код main.c, скомпилированный в исполняемый файл my_prog_advanced).</w:t>
+        </w:rPr>
+        <w:t xml:space="preserve">Утилита </w:t>
+      </w:r>
+      <w:r>
+        <w:rPr>
+          <w:sz w:val="28"/>
+          <w:szCs w:val="28"/>
+          <w:lang w:val="en-US"/>
+        </w:rPr>
+        <w:t xml:space="preserve">dtruss </w:t>
+      </w:r>
+    </w:p>
+    <w:p>
+      <w:pPr>
+        <w:pStyle w:val="a4"/>
+        <w:rPr>
+          <w:sz w:val="28"/>
+          <w:szCs w:val="28"/>
+          <w:lang w:val="en-US"/>
+        </w:rPr>
+      </w:pPr>
+      <w:r>
+        <w:rPr>
+          <w:sz w:val="28"/>
+          <w:szCs w:val="28"/>
+        </w:rPr>
+        <w:t xml:space="preserve">Терминал </w:t>
+      </w:r>
+      <w:r>
+        <w:rPr>
+          <w:sz w:val="28"/>
+          <w:szCs w:val="28"/>
+          <w:lang w:val="en-US"/>
+        </w:rPr>
+        <w:t>zsh</w:t>
       </w:r>
     </w:p>
     <w:p>
@@ -660,8 +690,8 @@
           <w:lang w:val="ru-RU"/>
         </w:rPr>
       </w:pPr>
-      <w:bookmarkStart w:id="4" w:name="_v5mvawbbheb4" w:colFirst="0" w:colLast="0"/>
-      <w:bookmarkEnd w:id="4"/>
+      <w:bookmarkStart w:id="3" w:name="_v5mvawbbheb4" w:colFirst="0" w:colLast="0"/>
+      <w:bookmarkEnd w:id="3"/>
       <w:r>
         <w:rPr>
           <w:lang w:val="ru-RU"/>
@@ -763,18 +793,129 @@
         <w:rPr>
           <w:lang w:val="ru-RU"/>
         </w:rPr>
-        <w:t xml:space="preserve"> маршрутизации и порождения процессов</w:t>
-      </w:r>
-    </w:p>
-    <w:p>
-      <w:pPr>
-        <w:ind w:left="720" w:firstLine="0"/>
-      </w:pPr>
+        <w:t xml:space="preserve"> </w:t>
+      </w:r>
+      <w:bookmarkStart w:id="4" w:name="_GoBack"/>
+      <w:bookmarkEnd w:id="4"/>
+      <w:r>
+        <w:rPr>
+          <w:lang w:val="ru-RU"/>
+        </w:rPr>
+        <w:t>маршрутизации и порождения процессов</w:t>
+      </w:r>
     </w:p>
     <w:p>
       <w:pPr>
         <w:ind w:firstLine="0"/>
-      </w:pPr>
+        <w:rPr>
+          <w:lang w:val="ru-RU"/>
+        </w:rPr>
+      </w:pPr>
+      <w:r>
+        <w:t xml:space="preserve">Был склонирован образ </w:t>
+      </w:r>
+      <w:r>
+        <w:rPr>
+          <w:lang w:val="en-US"/>
+        </w:rPr>
+        <w:t>zsh</w:t>
+      </w:r>
+      <w:r>
+        <w:rPr>
+          <w:lang w:val="ru-RU"/>
+        </w:rPr>
+        <w:t xml:space="preserve"> </w:t>
+      </w:r>
+      <w:r>
+        <w:rPr>
+          <w:lang w:val="ru-RU"/>
+        </w:rPr>
+        <w:t xml:space="preserve">и перемещён в пользовательскую директорию (тк </w:t>
+      </w:r>
+      <w:r>
+        <w:rPr>
+          <w:lang w:val="en-US"/>
+        </w:rPr>
+        <w:t>SIP</w:t>
+      </w:r>
+      <w:r>
+        <w:rPr>
+          <w:lang w:val="ru-RU"/>
+        </w:rPr>
+        <w:t xml:space="preserve"> </w:t>
+      </w:r>
+      <w:r>
+        <w:rPr>
+          <w:lang w:val="ru-RU"/>
+        </w:rPr>
+        <w:t>система не даст просмотреть системные вызовы приложений не в юзер директории)</w:t>
+      </w:r>
+      <w:r>
+        <w:rPr>
+          <w:lang w:val="ru-RU"/>
+        </w:rPr>
+        <w:t>.</w:t>
+      </w:r>
+      <w:r>
+        <w:rPr>
+          <w:lang w:val="ru-RU"/>
+        </w:rPr>
+        <w:t xml:space="preserve"> Использована </w:t>
+      </w:r>
+      <w:r>
+        <w:rPr>
+          <w:lang w:val="en-US"/>
+        </w:rPr>
+        <w:t>dtruss</w:t>
+      </w:r>
+      <w:r>
+        <w:rPr>
+          <w:lang w:val="ru-RU"/>
+        </w:rPr>
+        <w:t xml:space="preserve"> </w:t>
+      </w:r>
+      <w:r>
+        <w:rPr>
+          <w:lang w:val="ru-RU"/>
+        </w:rPr>
+        <w:t xml:space="preserve">во время работы </w:t>
+      </w:r>
+      <w:r>
+        <w:rPr>
+          <w:lang w:val="en-US"/>
+        </w:rPr>
+        <w:t>zsh</w:t>
+      </w:r>
+      <w:r>
+        <w:rPr>
+          <w:lang w:val="ru-RU"/>
+        </w:rPr>
+        <w:t xml:space="preserve"> </w:t>
+      </w:r>
+      <w:r>
+        <w:rPr>
+          <w:lang w:val="ru-RU"/>
+        </w:rPr>
+        <w:t>– просканированы системные вызовы во время выполнения команд</w:t>
+      </w:r>
+      <w:r>
+        <w:rPr>
+          <w:lang w:val="ru-RU"/>
+        </w:rPr>
+        <w:t>.</w:t>
+      </w:r>
+      <w:r>
+        <w:rPr>
+          <w:lang w:val="ru-RU"/>
+        </w:rPr>
+        <w:t xml:space="preserve"> Затем вызовы были отфильтрованы по типам с помощью </w:t>
+      </w:r>
+      <w:r>
+        <w:rPr>
+          <w:lang w:val="en-US"/>
+        </w:rPr>
+        <w:t>grep.</w:t>
+      </w:r>
     </w:p>
     <w:tbl>
       <w:tblPr>
@@ -1206,6 +1347,7 @@
               <w:rPr>
                 <w:lang w:val="ru-RU"/>
               </w:rPr>
+              <w:lastRenderedPageBreak/>
               <w:t>Порождение процессов</w:t>
             </w:r>
           </w:p>
@@ -1374,26 +1516,259 @@
     </w:tbl>
     <w:p>
       <w:pPr>
+        <w:keepNext/>
         <w:ind w:firstLine="0"/>
-        <w:rPr>
-          <w:lang w:val="en-US"/>
-        </w:rPr>
-      </w:pPr>
-      <w:r>
-        <w:rPr>
-          <w:lang w:val="en-US"/>
+      </w:pPr>
+      <w:r>
+        <w:rPr>
+          <w:lang w:val="ru-RU"/>
+        </w:rPr>
+        <w:br/>
+      </w:r>
+      <w:r>
+        <w:rPr>
+          <w:lang w:val="ru-RU"/>
+        </w:rPr>
+        <w:drawing>
+          <wp:inline distT="0" distB="0" distL="0" distR="0" wp14:anchorId="0E468CE2" wp14:editId="5483634F">
+            <wp:extent cx="6123305" cy="6008370"/>
+            <wp:effectExtent l="0" t="0" r="0" b="0"/>
+            <wp:docPr id="2" name="Рисунок 2"/>
+            <wp:cNvGraphicFramePr>
+              <a:graphicFrameLocks xmlns:a="http://schemas.openxmlformats.org/drawingml/2006/main" noChangeAspect="1"/>
+            </wp:cNvGraphicFramePr>
+            <a:graphic xmlns:a="http://schemas.openxmlformats.org/drawingml/2006/main">
+              <a:graphicData uri="http://schemas.openxmlformats.org/drawingml/2006/picture">
+                <pic:pic xmlns:pic="http://schemas.openxmlformats.org/drawingml/2006/picture">
+                  <pic:nvPicPr>
+                    <pic:cNvPr id="1" name=""/>
+                    <pic:cNvPicPr/>
+                  </pic:nvPicPr>
+                  <pic:blipFill>
+                    <a:blip r:embed="rId7"/>
+                    <a:stretch>
+                      <a:fillRect/>
+                    </a:stretch>
+                  </pic:blipFill>
+                  <pic:spPr>
+                    <a:xfrm>
+                      <a:off x="0" y="0"/>
+                      <a:ext cx="6123305" cy="6008370"/>
+                    </a:xfrm>
+                    <a:prstGeom prst="rect">
+                      <a:avLst/>
+                    </a:prstGeom>
+                  </pic:spPr>
+                </pic:pic>
+              </a:graphicData>
+            </a:graphic>
+          </wp:inline>
+        </w:drawing>
+      </w:r>
+    </w:p>
+    <w:p>
+      <w:pPr>
+        <w:pStyle w:val="a6"/>
+        <w:ind w:firstLine="0"/>
+        <w:rPr>
+          <w:lang w:val="ru-RU"/>
+        </w:rPr>
+      </w:pPr>
+      <w:r>
+        <w:rPr>
+          <w:lang w:val="ru-RU"/>
+        </w:rPr>
+        <w:t>Процесс выделение системных вызовов 1</w:t>
+      </w:r>
+    </w:p>
+    <w:p>
+      <w:pPr>
+        <w:keepNext/>
+        <w:ind w:firstLine="0"/>
+      </w:pPr>
+      <w:r>
+        <w:rPr>
+          <w:lang w:val="ru-RU"/>
         </w:rPr>
         <w:lastRenderedPageBreak/>
-        <w:br/>
-      </w:r>
-    </w:p>
-    <w:p>
-      <w:pPr>
+        <w:drawing>
+          <wp:inline distT="0" distB="0" distL="0" distR="0" wp14:anchorId="104FACD2" wp14:editId="7B82B51E">
+            <wp:extent cx="6123305" cy="2693670"/>
+            <wp:effectExtent l="0" t="0" r="0" b="0"/>
+            <wp:docPr id="3" name="Рисунок 3"/>
+            <wp:cNvGraphicFramePr>
+              <a:graphicFrameLocks xmlns:a="http://schemas.openxmlformats.org/drawingml/2006/main" noChangeAspect="1"/>
+            </wp:cNvGraphicFramePr>
+            <a:graphic xmlns:a="http://schemas.openxmlformats.org/drawingml/2006/main">
+              <a:graphicData uri="http://schemas.openxmlformats.org/drawingml/2006/picture">
+                <pic:pic xmlns:pic="http://schemas.openxmlformats.org/drawingml/2006/picture">
+                  <pic:nvPicPr>
+                    <pic:cNvPr id="1" name=""/>
+                    <pic:cNvPicPr/>
+                  </pic:nvPicPr>
+                  <pic:blipFill>
+                    <a:blip r:embed="rId8"/>
+                    <a:stretch>
+                      <a:fillRect/>
+                    </a:stretch>
+                  </pic:blipFill>
+                  <pic:spPr>
+                    <a:xfrm>
+                      <a:off x="0" y="0"/>
+                      <a:ext cx="6123305" cy="2693670"/>
+                    </a:xfrm>
+                    <a:prstGeom prst="rect">
+                      <a:avLst/>
+                    </a:prstGeom>
+                  </pic:spPr>
+                </pic:pic>
+              </a:graphicData>
+            </a:graphic>
+          </wp:inline>
+        </w:drawing>
+      </w:r>
+    </w:p>
+    <w:p>
+      <w:pPr>
+        <w:pStyle w:val="a6"/>
         <w:ind w:firstLine="0"/>
-        <w:jc w:val="center"/>
-        <w:rPr>
-          <w:sz w:val="32"/>
-          <w:szCs w:val="32"/>
+        <w:rPr>
+          <w:lang w:val="ru-RU"/>
+        </w:rPr>
+      </w:pPr>
+      <w:r>
+        <w:rPr>
+          <w:lang w:val="ru-RU"/>
+        </w:rPr>
+        <w:t>Проце</w:t>
+      </w:r>
+      <w:r>
+        <w:rPr>
+          <w:lang w:val="ru-RU"/>
+        </w:rPr>
+        <w:t>сс выделение системных вызовов 2</w:t>
+      </w:r>
+    </w:p>
+    <w:p>
+      <w:pPr>
+        <w:keepNext/>
+        <w:ind w:firstLine="0"/>
+      </w:pPr>
+      <w:r>
+        <w:rPr>
+          <w:lang w:val="ru-RU"/>
+        </w:rPr>
+        <w:drawing>
+          <wp:inline distT="0" distB="0" distL="0" distR="0" wp14:anchorId="6F714CB5" wp14:editId="6474DD14">
+            <wp:extent cx="6123305" cy="3271520"/>
+            <wp:effectExtent l="0" t="0" r="0" b="5080"/>
+            <wp:docPr id="4" name="Рисунок 4"/>
+            <wp:cNvGraphicFramePr>
+              <a:graphicFrameLocks xmlns:a="http://schemas.openxmlformats.org/drawingml/2006/main" noChangeAspect="1"/>
+            </wp:cNvGraphicFramePr>
+            <a:graphic xmlns:a="http://schemas.openxmlformats.org/drawingml/2006/main">
+              <a:graphicData uri="http://schemas.openxmlformats.org/drawingml/2006/picture">
+                <pic:pic xmlns:pic="http://schemas.openxmlformats.org/drawingml/2006/picture">
+                  <pic:nvPicPr>
+                    <pic:cNvPr id="1" name=""/>
+                    <pic:cNvPicPr/>
+                  </pic:nvPicPr>
+                  <pic:blipFill>
+                    <a:blip r:embed="rId9"/>
+                    <a:stretch>
+                      <a:fillRect/>
+                    </a:stretch>
+                  </pic:blipFill>
+                  <pic:spPr>
+                    <a:xfrm>
+                      <a:off x="0" y="0"/>
+                      <a:ext cx="6123305" cy="3271520"/>
+                    </a:xfrm>
+                    <a:prstGeom prst="rect">
+                      <a:avLst/>
+                    </a:prstGeom>
+                  </pic:spPr>
+                </pic:pic>
+              </a:graphicData>
+            </a:graphic>
+          </wp:inline>
+        </w:drawing>
+      </w:r>
+    </w:p>
+    <w:p>
+      <w:pPr>
+        <w:pStyle w:val="a6"/>
+        <w:ind w:firstLine="0"/>
+        <w:rPr>
+          <w:lang w:val="ru-RU"/>
+        </w:rPr>
+      </w:pPr>
+      <w:r>
+        <w:rPr>
+          <w:lang w:val="ru-RU"/>
+        </w:rPr>
+        <w:t>Проце</w:t>
+      </w:r>
+      <w:r>
+        <w:rPr>
+          <w:lang w:val="ru-RU"/>
+        </w:rPr>
+        <w:t>сс выделение системных вызовов 3</w:t>
+      </w:r>
+    </w:p>
+    <w:p>
+      <w:pPr>
+        <w:keepNext/>
+        <w:ind w:firstLine="0"/>
+      </w:pPr>
+      <w:r>
+        <w:rPr>
+          <w:lang w:val="ru-RU"/>
+        </w:rPr>
+        <w:lastRenderedPageBreak/>
+        <w:drawing>
+          <wp:inline distT="0" distB="0" distL="0" distR="0" wp14:anchorId="3C08271D" wp14:editId="1FD161CC">
+            <wp:extent cx="6123305" cy="3344545"/>
+            <wp:effectExtent l="0" t="0" r="0" b="8255"/>
+            <wp:docPr id="5" name="Рисунок 5"/>
+            <wp:cNvGraphicFramePr>
+              <a:graphicFrameLocks xmlns:a="http://schemas.openxmlformats.org/drawingml/2006/main" noChangeAspect="1"/>
+            </wp:cNvGraphicFramePr>
+            <a:graphic xmlns:a="http://schemas.openxmlformats.org/drawingml/2006/main">
+              <a:graphicData uri="http://schemas.openxmlformats.org/drawingml/2006/picture">
+                <pic:pic xmlns:pic="http://schemas.openxmlformats.org/drawingml/2006/picture">
+                  <pic:nvPicPr>
+                    <pic:cNvPr id="1" name=""/>
+                    <pic:cNvPicPr/>
+                  </pic:nvPicPr>
+                  <pic:blipFill>
+                    <a:blip r:embed="rId10"/>
+                    <a:stretch>
+                      <a:fillRect/>
+                    </a:stretch>
+                  </pic:blipFill>
+                  <pic:spPr>
+                    <a:xfrm>
+                      <a:off x="0" y="0"/>
+                      <a:ext cx="6123305" cy="3344545"/>
+                    </a:xfrm>
+                    <a:prstGeom prst="rect">
+                      <a:avLst/>
+                    </a:prstGeom>
+                  </pic:spPr>
+                </pic:pic>
+              </a:graphicData>
+            </a:graphic>
+          </wp:inline>
+        </w:drawing>
+      </w:r>
+    </w:p>
+    <w:p>
+      <w:pPr>
+        <w:pStyle w:val="a6"/>
+        <w:ind w:firstLine="0"/>
+        <w:rPr>
+          <w:lang w:val="ru-RU"/>
         </w:rPr>
       </w:pPr>
       <w:bookmarkStart w:id="5" w:name="_1pqjsk87if2" w:colFirst="0" w:colLast="0"/>
@@ -1402,11 +1777,27 @@
       <w:bookmarkEnd w:id="6"/>
       <w:r>
         <w:rPr>
+          <w:lang w:val="ru-RU"/>
+        </w:rPr>
+        <w:t>Проце</w:t>
+      </w:r>
+      <w:r>
+        <w:rPr>
+          <w:lang w:val="ru-RU"/>
+        </w:rPr>
+        <w:t>сс выделение системных вызовов 4</w:t>
+      </w:r>
+    </w:p>
+    <w:p>
+      <w:pPr>
+        <w:ind w:firstLine="0"/>
+        <w:jc w:val="center"/>
+        <w:rPr>
           <w:sz w:val="32"/>
           <w:szCs w:val="32"/>
-        </w:rPr>
-        <w:t>Результаты профилирования и анализ системных вызовов</w:t>
-      </w:r>
+          <w:lang w:val="ru-RU"/>
+        </w:rPr>
+      </w:pPr>
     </w:p>
     <w:p>
       <w:pPr>
@@ -1417,6 +1808,23 @@
           <w:szCs w:val="32"/>
         </w:rPr>
       </w:pPr>
+      <w:r>
+        <w:rPr>
+          <w:sz w:val="32"/>
+          <w:szCs w:val="32"/>
+        </w:rPr>
+        <w:t>Результаты профилирования и анализ системных вызовов</w:t>
+      </w:r>
+    </w:p>
+    <w:p>
+      <w:pPr>
+        <w:ind w:firstLine="0"/>
+        <w:jc w:val="center"/>
+        <w:rPr>
+          <w:sz w:val="32"/>
+          <w:szCs w:val="32"/>
+        </w:rPr>
+      </w:pPr>
     </w:p>
     <w:p>
       <w:pPr>
@@ -1432,7 +1840,7 @@
         <w:ind w:firstLine="0"/>
         <w:jc w:val="left"/>
         <w:rPr>
-          <w:lang w:val="en-US"/>
+          <w:lang w:val="ru-RU"/>
         </w:rPr>
       </w:pPr>
       <w:r>
@@ -1440,7 +1848,7 @@
       </w:r>
       <w:r>
         <w:rPr>
-          <w:lang w:val="en-US"/>
+          <w:lang w:val="ru-RU"/>
         </w:rPr>
         <w:t xml:space="preserve"> </w:t>
       </w:r>
@@ -1449,7 +1857,7 @@
       </w:r>
       <w:r>
         <w:rPr>
-          <w:lang w:val="en-US"/>
+          <w:lang w:val="ru-RU"/>
         </w:rPr>
         <w:t>:</w:t>
       </w:r>
@@ -1464,9 +1872,51 @@
       </w:pPr>
       <w:r>
         <w:rPr>
-          <w:lang w:val="en-US"/>
-        </w:rPr>
-        <w:t>10056/0x19923: open("non_existent.txt\0", 0x0, 0x0) = -1 2</w:t>
+          <w:lang w:val="ru-RU"/>
+        </w:rPr>
+        <w:t>10056/0</w:t>
+      </w:r>
+      <w:r>
+        <w:rPr>
+          <w:lang w:val="en-US"/>
+        </w:rPr>
+        <w:t>x</w:t>
+      </w:r>
+      <w:r>
+        <w:rPr>
+          <w:lang w:val="ru-RU"/>
+        </w:rPr>
+        <w:t xml:space="preserve">19923: </w:t>
+      </w:r>
+      <w:r>
+        <w:rPr>
+          <w:lang w:val="en-US"/>
+        </w:rPr>
+        <w:t>open</w:t>
+      </w:r>
+      <w:r>
+        <w:rPr>
+          <w:lang w:val="ru-RU"/>
+        </w:rPr>
+        <w:t>("</w:t>
+      </w:r>
+      <w:r>
+        <w:rPr>
+          <w:lang w:val="en-US"/>
+        </w:rPr>
+        <w:t>non</w:t>
+      </w:r>
+      <w:r>
+        <w:rPr>
+          <w:lang w:val="ru-RU"/>
+        </w:rPr>
+        <w:t>_</w:t>
+      </w:r>
+      <w:r>
+        <w:rPr>
+          <w:lang w:val="en-US"/>
+        </w:rPr>
+        <w:t>existent.txt\0", 0x0, 0x0) = -1 2</w:t>
       </w:r>
     </w:p>
     <w:p>
@@ -1538,6 +1988,7 @@
         <w:rPr>
           <w:lang w:val="en-US"/>
         </w:rPr>
+        <w:lastRenderedPageBreak/>
         <w:t>10056/0x19923: dup2(0x3, 0x1) = 1 0</w:t>
       </w:r>
     </w:p>
@@ -1745,7 +2196,6 @@
         <w:rPr>
           <w:lang w:val="en-US"/>
         </w:rPr>
-        <w:lastRenderedPageBreak/>
         <w:t>10057/0x1993a: fork() = 0 0</w:t>
       </w:r>
     </w:p>
@@ -1800,10 +2250,483 @@
     <w:p>
       <w:pPr>
         <w:ind w:firstLine="0"/>
-        <w:jc w:val="center"/>
-        <w:rPr>
-          <w:sz w:val="32"/>
-          <w:szCs w:val="32"/>
+        <w:jc w:val="left"/>
+        <w:rPr>
+          <w:lang w:val="ru-RU"/>
+        </w:rPr>
+      </w:pPr>
+      <w:r>
+        <w:rPr>
+          <w:lang w:val="ru-RU"/>
+        </w:rPr>
+        <w:t xml:space="preserve">Примеры системных вызовов с привязкой к </w:t>
+      </w:r>
+      <w:r>
+        <w:rPr>
+          <w:lang w:val="en-US"/>
+        </w:rPr>
+        <w:t>zsh</w:t>
+      </w:r>
+      <w:r>
+        <w:rPr>
+          <w:lang w:val="ru-RU"/>
+        </w:rPr>
+        <w:t xml:space="preserve"> </w:t>
+      </w:r>
+      <w:r>
+        <w:rPr>
+          <w:lang w:val="ru-RU"/>
+        </w:rPr>
+        <w:t>процессам:</w:t>
+      </w:r>
+    </w:p>
+    <w:p>
+      <w:pPr>
+        <w:ind w:firstLine="0"/>
+        <w:jc w:val="left"/>
+        <w:rPr>
+          <w:sz w:val="24"/>
+          <w:szCs w:val="24"/>
+          <w:lang w:val="ru-RU"/>
+        </w:rPr>
+      </w:pPr>
+      <w:r>
+        <w:rPr>
+          <w:lang w:val="ru-RU"/>
+        </w:rPr>
+        <w:t>Настройка времени и языка</w:t>
+      </w:r>
+      <w:r>
+        <w:rPr>
+          <w:lang w:val="ru-RU"/>
+        </w:rPr>
+        <w:t>:</w:t>
+      </w:r>
+      <w:r>
+        <w:rPr>
+          <w:rFonts w:ascii="Arial" w:hAnsi="Arial" w:cs="Arial"/>
+          <w:color w:val="FFFFFF"/>
+          <w:sz w:val="21"/>
+          <w:szCs w:val="21"/>
+          <w:lang w:val="ru-RU"/>
+        </w:rPr>
+        <w:t xml:space="preserve"> </w:t>
+      </w:r>
+      <w:r>
+        <w:rPr>
+          <w:rFonts w:ascii="Arial" w:hAnsi="Arial" w:cs="Arial"/>
+          <w:color w:val="FFFFFF"/>
+          <w:sz w:val="21"/>
+          <w:szCs w:val="21"/>
+          <w:lang w:val="ru-RU"/>
+        </w:rPr>
+        <w:t>_</w:t>
+      </w:r>
+      <w:r>
+        <w:rPr>
+          <w:rFonts w:ascii="Arial" w:hAnsi="Arial" w:cs="Arial"/>
+          <w:color w:val="FFFFFF"/>
+          <w:sz w:val="21"/>
+          <w:szCs w:val="21"/>
+          <w:lang w:val="en-US"/>
+        </w:rPr>
+        <w:t>RU</w:t>
+      </w:r>
+      <w:r>
+        <w:rPr>
+          <w:rFonts w:ascii="Arial" w:hAnsi="Arial" w:cs="Arial"/>
+          <w:color w:val="FFFFFF"/>
+          <w:sz w:val="21"/>
+          <w:szCs w:val="21"/>
+          <w:lang w:val="ru-RU"/>
+        </w:rPr>
+        <w:t>.</w:t>
+      </w:r>
+      <w:r>
+        <w:rPr>
+          <w:rFonts w:ascii="Arial" w:hAnsi="Arial" w:cs="Arial"/>
+          <w:color w:val="FFFFFF"/>
+          <w:sz w:val="21"/>
+          <w:szCs w:val="21"/>
+          <w:lang w:val="en-US"/>
+        </w:rPr>
+        <w:t>UTF</w:t>
+      </w:r>
+      <w:r>
+        <w:rPr>
+          <w:rFonts w:ascii="Arial" w:hAnsi="Arial" w:cs="Arial"/>
+          <w:color w:val="FFFFFF"/>
+          <w:sz w:val="21"/>
+          <w:szCs w:val="21"/>
+          <w:lang w:val="ru-RU"/>
+        </w:rPr>
+        <w:t>-8/</w:t>
+      </w:r>
+      <w:r>
+        <w:rPr>
+          <w:rFonts w:ascii="Arial" w:hAnsi="Arial" w:cs="Arial"/>
+          <w:color w:val="FFFFFF"/>
+          <w:sz w:val="21"/>
+          <w:szCs w:val="21"/>
+          <w:lang w:val="en-US"/>
+        </w:rPr>
+        <w:t>LC</w:t>
+      </w:r>
+      <w:r>
+        <w:rPr>
+          <w:rFonts w:ascii="Arial" w:hAnsi="Arial" w:cs="Arial"/>
+          <w:color w:val="FFFFFF"/>
+          <w:sz w:val="21"/>
+          <w:szCs w:val="21"/>
+          <w:lang w:val="ru-RU"/>
+        </w:rPr>
+        <w:t>_</w:t>
+      </w:r>
+      <w:r>
+        <w:rPr>
+          <w:rFonts w:ascii="Arial" w:hAnsi="Arial" w:cs="Arial"/>
+          <w:color w:val="FFFFFF"/>
+          <w:sz w:val="21"/>
+          <w:szCs w:val="21"/>
+          <w:lang w:val="en-US"/>
+        </w:rPr>
+        <w:t>COLLATE</w:t>
+      </w:r>
+      <w:r>
+        <w:rPr>
+          <w:rFonts w:ascii="Arial" w:hAnsi="Arial" w:cs="Arial"/>
+          <w:color w:val="FFFFFF"/>
+          <w:sz w:val="21"/>
+          <w:szCs w:val="21"/>
+          <w:lang w:val="ru-RU"/>
+        </w:rPr>
+        <w:t>\0", 0</w:t>
+      </w:r>
+      <w:r>
+        <w:rPr>
+          <w:rFonts w:ascii="Arial" w:hAnsi="Arial" w:cs="Arial"/>
+          <w:color w:val="FFFFFF"/>
+          <w:sz w:val="21"/>
+          <w:szCs w:val="21"/>
+          <w:lang w:val="en-US"/>
+        </w:rPr>
+        <w:t>x</w:t>
+      </w:r>
+      <w:r>
+        <w:rPr>
+          <w:rFonts w:ascii="Arial" w:hAnsi="Arial" w:cs="Arial"/>
+          <w:color w:val="FFFFFF"/>
+          <w:sz w:val="21"/>
+          <w:szCs w:val="21"/>
+          <w:lang w:val="ru-RU"/>
+        </w:rPr>
+        <w:t>0, 0</w:t>
+      </w:r>
+      <w:r>
+        <w:rPr>
+          <w:rFonts w:ascii="Arial" w:hAnsi="Arial" w:cs="Arial"/>
+          <w:color w:val="FFFFFF"/>
+          <w:sz w:val="21"/>
+          <w:szCs w:val="21"/>
+          <w:lang w:val="en-US"/>
+        </w:rPr>
+        <w:t>x</w:t>
+      </w:r>
+      <w:r>
+        <w:rPr>
+          <w:rFonts w:ascii="Arial" w:hAnsi="Arial" w:cs="Arial"/>
+          <w:color w:val="FFFFFF"/>
+          <w:sz w:val="21"/>
+          <w:szCs w:val="21"/>
+          <w:lang w:val="ru-RU"/>
+        </w:rPr>
+        <w:t>0) = 3 0</w:t>
+      </w:r>
+    </w:p>
+    <w:p>
+      <w:pPr>
+        <w:pStyle w:val="a4"/>
+        <w:spacing w:before="0" w:beforeAutospacing="0" w:after="0" w:afterAutospacing="0"/>
+        <w:rPr>
+          <w:lang w:val="en-US"/>
+        </w:rPr>
+      </w:pPr>
+      <w:r>
+        <w:rPr>
+          <w:sz w:val="28"/>
+          <w:szCs w:val="28"/>
+          <w:lang w:val="en-US"/>
+        </w:rPr>
+        <w:t>open_nocancel("/etc/localtime\0",</w:t>
+      </w:r>
+      <w:r>
+        <w:rPr>
+          <w:rFonts w:ascii="Arial" w:hAnsi="Arial" w:cs="Arial"/>
+          <w:color w:val="FFFFFF"/>
+          <w:sz w:val="21"/>
+          <w:szCs w:val="21"/>
+          <w:lang w:val="en-US"/>
+        </w:rPr>
+        <w:t xml:space="preserve"> 0x0, 0x0) = 11 0</w:t>
+      </w:r>
+    </w:p>
+    <w:p>
+      <w:pPr>
+        <w:ind w:firstLine="0"/>
+        <w:jc w:val="left"/>
+        <w:rPr>
+          <w:lang w:val="en-US"/>
+        </w:rPr>
+      </w:pPr>
+    </w:p>
+    <w:p>
+      <w:pPr>
+        <w:pStyle w:val="a4"/>
+        <w:spacing w:before="0" w:beforeAutospacing="0" w:after="0" w:afterAutospacing="0"/>
+        <w:rPr>
+          <w:sz w:val="28"/>
+          <w:szCs w:val="28"/>
+          <w:lang w:val="en-US"/>
+        </w:rPr>
+      </w:pPr>
+      <w:r>
+        <w:rPr>
+          <w:sz w:val="28"/>
+          <w:szCs w:val="28"/>
+          <w:lang w:val="en-US"/>
+        </w:rPr>
+        <w:t>Загрузка терминала:</w:t>
+      </w:r>
+    </w:p>
+    <w:p>
+      <w:pPr>
+        <w:pStyle w:val="a4"/>
+        <w:spacing w:before="0" w:beforeAutospacing="0" w:after="0" w:afterAutospacing="0"/>
+        <w:rPr>
+          <w:sz w:val="28"/>
+          <w:szCs w:val="28"/>
+          <w:lang w:val="en-US"/>
+        </w:rPr>
+      </w:pPr>
+      <w:r>
+        <w:rPr>
+          <w:sz w:val="28"/>
+          <w:szCs w:val="28"/>
+          <w:lang w:val="en-US"/>
+        </w:rPr>
+        <w:t>open("/usr/share/terminfo/78/xterm-256color\0", 0x0, 0x0) = 11 0</w:t>
+      </w:r>
+    </w:p>
+    <w:p>
+      <w:pPr>
+        <w:pStyle w:val="a4"/>
+        <w:spacing w:before="0" w:beforeAutospacing="0" w:after="0" w:afterAutospacing="0"/>
+        <w:rPr>
+          <w:sz w:val="28"/>
+          <w:szCs w:val="28"/>
+          <w:lang w:val="en-US"/>
+        </w:rPr>
+      </w:pPr>
+    </w:p>
+    <w:p>
+      <w:pPr>
+        <w:pStyle w:val="a4"/>
+        <w:spacing w:before="0" w:beforeAutospacing="0" w:after="0" w:afterAutospacing="0"/>
+        <w:rPr>
+          <w:sz w:val="28"/>
+          <w:szCs w:val="28"/>
+          <w:lang w:val="en-US"/>
+        </w:rPr>
+      </w:pPr>
+      <w:r>
+        <w:rPr>
+          <w:sz w:val="28"/>
+          <w:szCs w:val="28"/>
+          <w:lang w:val="en-US"/>
+        </w:rPr>
+        <w:t>Подгрузка библиотек</w:t>
+      </w:r>
+      <w:r>
+        <w:rPr>
+          <w:sz w:val="28"/>
+          <w:szCs w:val="28"/>
+          <w:lang w:val="en-US"/>
+        </w:rPr>
+        <w:t>:</w:t>
+      </w:r>
+    </w:p>
+    <w:p>
+      <w:pPr>
+        <w:pStyle w:val="a4"/>
+        <w:spacing w:before="0" w:beforeAutospacing="0" w:after="0" w:afterAutospacing="0"/>
+        <w:rPr>
+          <w:sz w:val="28"/>
+          <w:szCs w:val="28"/>
+          <w:lang w:val="en-US"/>
+        </w:rPr>
+      </w:pPr>
+      <w:r>
+        <w:rPr>
+          <w:sz w:val="28"/>
+          <w:szCs w:val="28"/>
+          <w:lang w:val="en-US"/>
+        </w:rPr>
+        <w:t>open("/usr/lib/zsh/5.8.1/zsh/zle.so\0", 0x0, 0x0) = 3 0</w:t>
+      </w:r>
+    </w:p>
+    <w:p>
+      <w:pPr>
+        <w:pStyle w:val="a4"/>
+        <w:spacing w:before="0" w:beforeAutospacing="0" w:after="0" w:afterAutospacing="0"/>
+        <w:rPr>
+          <w:sz w:val="28"/>
+          <w:szCs w:val="28"/>
+          <w:lang w:val="en-US"/>
+        </w:rPr>
+      </w:pPr>
+      <w:r>
+        <w:rPr>
+          <w:sz w:val="28"/>
+          <w:szCs w:val="28"/>
+          <w:lang w:val="en-US"/>
+        </w:rPr>
+        <w:lastRenderedPageBreak/>
+        <w:t>Сканирование путей через Path:</w:t>
+      </w:r>
+    </w:p>
+    <w:p>
+      <w:pPr>
+        <w:pStyle w:val="a4"/>
+        <w:spacing w:before="0" w:beforeAutospacing="0" w:after="0" w:afterAutospacing="0"/>
+        <w:rPr>
+          <w:sz w:val="28"/>
+          <w:szCs w:val="28"/>
+          <w:lang w:val="en-US"/>
+        </w:rPr>
+      </w:pPr>
+      <w:r>
+        <w:rPr>
+          <w:sz w:val="28"/>
+          <w:szCs w:val="28"/>
+          <w:lang w:val="en-US"/>
+        </w:rPr>
+        <w:t>open_nocancel("/Users/nadusha/.local/bin\0", 0x1100004, 0x0) = 3 0</w:t>
+      </w:r>
+    </w:p>
+    <w:p>
+      <w:pPr>
+        <w:pStyle w:val="a4"/>
+        <w:spacing w:before="0" w:beforeAutospacing="0" w:after="0" w:afterAutospacing="0"/>
+        <w:rPr>
+          <w:sz w:val="28"/>
+          <w:szCs w:val="28"/>
+          <w:lang w:val="en-US"/>
+        </w:rPr>
+      </w:pPr>
+      <w:r>
+        <w:rPr>
+          <w:sz w:val="28"/>
+          <w:szCs w:val="28"/>
+          <w:lang w:val="en-US"/>
+        </w:rPr>
+        <w:t>open_nocancel("/usr/bin\0", 0x1100004, 0x0) = 3 0</w:t>
+      </w:r>
+    </w:p>
+    <w:p>
+      <w:pPr>
+        <w:pStyle w:val="a4"/>
+        <w:spacing w:before="0" w:beforeAutospacing="0" w:after="0" w:afterAutospacing="0"/>
+        <w:rPr>
+          <w:sz w:val="28"/>
+          <w:szCs w:val="28"/>
+          <w:lang w:val="en-US"/>
+        </w:rPr>
+      </w:pPr>
+    </w:p>
+    <w:p>
+      <w:pPr>
+        <w:pStyle w:val="a4"/>
+        <w:spacing w:before="0" w:beforeAutospacing="0" w:after="0" w:afterAutospacing="0"/>
+        <w:rPr>
+          <w:sz w:val="28"/>
+          <w:szCs w:val="28"/>
+          <w:lang w:val="en-US"/>
+        </w:rPr>
+      </w:pPr>
+      <w:r>
+        <w:rPr>
+          <w:sz w:val="28"/>
+          <w:szCs w:val="28"/>
+          <w:lang w:val="en-US"/>
+        </w:rPr>
+        <w:t>Сохранение логов команд</w:t>
+      </w:r>
+      <w:r>
+        <w:rPr>
+          <w:sz w:val="28"/>
+          <w:szCs w:val="28"/>
+          <w:lang w:val="en-US"/>
+        </w:rPr>
+        <w:t>:</w:t>
+      </w:r>
+    </w:p>
+    <w:p>
+      <w:pPr>
+        <w:pStyle w:val="a4"/>
+        <w:spacing w:before="0" w:beforeAutospacing="0" w:after="0" w:afterAutospacing="0"/>
+        <w:rPr>
+          <w:sz w:val="28"/>
+          <w:szCs w:val="28"/>
+          <w:lang w:val="en-US"/>
+        </w:rPr>
+      </w:pPr>
+      <w:r>
+        <w:rPr>
+          <w:sz w:val="28"/>
+          <w:szCs w:val="28"/>
+          <w:lang w:val="en-US"/>
+        </w:rPr>
+        <w:t>open_nocancel("/Users/nadusha/.zsh_history\0", 0x0, 0x0) = 3 0</w:t>
+      </w:r>
+    </w:p>
+    <w:p>
+      <w:pPr>
+        <w:pStyle w:val="a4"/>
+        <w:spacing w:before="0" w:beforeAutospacing="0" w:after="0" w:afterAutospacing="0"/>
+        <w:rPr>
+          <w:sz w:val="28"/>
+          <w:szCs w:val="28"/>
+          <w:lang w:val="en-US"/>
+        </w:rPr>
+      </w:pPr>
+      <w:r>
+        <w:rPr>
+          <w:sz w:val="28"/>
+          <w:szCs w:val="28"/>
+          <w:lang w:val="en-US"/>
+        </w:rPr>
+        <w:t>open("/Users/nadusha/.zsh_history.new\0", 0xA01, 0x180) = 3 0</w:t>
+      </w:r>
+    </w:p>
+    <w:p>
+      <w:pPr>
+        <w:pStyle w:val="a4"/>
+        <w:spacing w:before="0" w:beforeAutospacing="0" w:after="0" w:afterAutospacing="0"/>
+        <w:rPr>
+          <w:sz w:val="28"/>
+          <w:szCs w:val="28"/>
+          <w:lang w:val="en-US"/>
+        </w:rPr>
+      </w:pPr>
+    </w:p>
+    <w:p>
+      <w:pPr>
+        <w:pStyle w:val="a4"/>
+        <w:spacing w:before="0" w:beforeAutospacing="0" w:after="0" w:afterAutospacing="0"/>
+        <w:rPr>
+          <w:sz w:val="28"/>
+          <w:szCs w:val="28"/>
+          <w:lang w:val="en-US"/>
         </w:rPr>
       </w:pPr>
     </w:p>
@@ -3081,7 +4004,7 @@
                 <w:color w:val="1F1F1F"/>
                 <w:sz w:val="24"/>
                 <w:szCs w:val="24"/>
-                <w:lang w:val="en-US"/>
+                <w:lang w:val="ru-RU"/>
               </w:rPr>
             </w:pPr>
           </w:p>
@@ -3131,7 +4054,6 @@
                 <w:bdr w:val="none" w:sz="0" w:space="0" w:color="auto" w:frame="1"/>
                 <w:lang w:val="ru-RU"/>
               </w:rPr>
-              <w:lastRenderedPageBreak/>
               <w:t>Управление процессами</w:t>
             </w:r>
           </w:p>
@@ -3536,6 +4458,7 @@
     </w:tbl>
     <w:p>
       <w:pPr>
+        <w:ind w:firstLine="0"/>
         <w:rPr>
           <w:lang w:val="ru-RU"/>
         </w:rPr>
@@ -3549,6 +4472,11 @@
       <w:bookmarkStart w:id="9" w:name="_xmdfryx7n08p" w:colFirst="0" w:colLast="0"/>
       <w:bookmarkEnd w:id="8"/>
       <w:bookmarkEnd w:id="9"/>
+    </w:p>
+    <w:p>
+      <w:pPr>
+        <w:pStyle w:val="1"/>
+      </w:pPr>
       <w:r>
         <w:t>Вывод</w:t>
       </w:r>
@@ -3568,24 +4496,14 @@
         <w:t xml:space="preserve">. </w:t>
       </w:r>
       <w:r>
-        <w:t>Анализ логов</w:t>
-      </w:r>
-      <w:r>
-        <w:t xml:space="preserve"> подтвердил корректную работу программы: успешный перехват кодов ошибок на уровне пользовательского пространства, безопасное перенаправление потоков ввода-вывода (dup2) без утечек дескрипторов (close) и корректное создание процессов (fork) с последующей</w:t>
-      </w:r>
-      <w:r>
-        <w:t xml:space="preserve"> синхронизацией (wait4)</w:t>
-      </w:r>
-      <w:r>
-        <w:t>. Использование языка C позволило получить исчерпывающий профиль системных вызовов ядра XNU/Darwin в обход ограничений System Integrity Protection (SIP) macOS</w:t>
-      </w:r>
-    </w:p>
-    <w:bookmarkEnd w:id="0"/>
+        <w:t>Анализ логов подтвердил корректную работу программы: успешный перехват кодов ошибок на уровне пользовательского пространства, безопасное перенаправление потоков ввода-вывода (dup2) без утечек дескрипторов (close) и корректное создание процессов (fork) с последующей синхронизацией (wait4). Использование языка C позволило получить исчерпывающий профиль системных вызовов ядра XNU/Darwin в обход ограничений System Integrity Protection (SIP) macOS</w:t>
+      </w:r>
+    </w:p>
     <w:p/>
     <w:sectPr>
-      <w:footerReference w:type="default" r:id="rId5"/>
-      <w:headerReference w:type="first" r:id="rId6"/>
-      <w:footerReference w:type="first" r:id="rId7"/>
+      <w:footerReference w:type="default" r:id="rId11"/>
+      <w:headerReference w:type="first" r:id="rId12"/>
+      <w:footerReference w:type="first" r:id="rId13"/>
       <w:pgSz w:w="11909" w:h="16834"/>
       <w:pgMar w:top="1133" w:right="566" w:bottom="1133" w:left="1700" w:header="720" w:footer="720" w:gutter="0"/>
       <w:pgNumType w:start="1"/>
@@ -3594,6 +4512,31 @@
     </w:sectPr>
   </w:body>
 </w:document>
+</file>
+
+<file path=word/endnotes.xml><?xml version="1.0" encoding="utf-8"?>
+<w:endnotes xmlns:wpc="http://schemas.microsoft.com/office/word/2010/wordprocessingCanvas" xmlns:mc="http://schemas.openxmlformats.org/markup-compatibility/2006" xmlns:o="urn:schemas-microsoft-com:office:office" xmlns:r="http://schemas.openxmlformats.org/officeDocument/2006/relationships" xmlns:m="http://schemas.openxmlformats.org/officeDocument/2006/math" xmlns:v="urn:schemas-microsoft-com:vml" xmlns:wp14="http://schemas.microsoft.com/office/word/2010/wordprocessingDrawing" xmlns:wp="http://schemas.openxmlformats.org/drawingml/2006/wordprocessingDrawing" xmlns:w10="urn:schemas-microsoft-com:office:word" xmlns:w="http://schemas.openxmlformats.org/wordprocessingml/2006/main" xmlns:w14="http://schemas.microsoft.com/office/word/2010/wordml" xmlns:w15="http://schemas.microsoft.com/office/word/2012/wordml" xmlns:wpg="http://schemas.microsoft.com/office/word/2010/wordprocessingGroup" xmlns:wpi="http://schemas.microsoft.com/office/word/2010/wordprocessingInk" xmlns:wne="http://schemas.microsoft.com/office/word/2006/wordml" xmlns:wps="http://schemas.microsoft.com/office/word/2010/wordprocessingShape" mc:Ignorable="w14 w15 wp14">
+  <w:endnote w:type="separator" w:id="-1">
+    <w:p>
+      <w:pPr>
+        <w:spacing w:line="240" w:lineRule="auto"/>
+      </w:pPr>
+      <w:r>
+        <w:separator/>
+      </w:r>
+    </w:p>
+  </w:endnote>
+  <w:endnote w:type="continuationSeparator" w:id="0">
+    <w:p>
+      <w:pPr>
+        <w:spacing w:line="240" w:lineRule="auto"/>
+      </w:pPr>
+      <w:r>
+        <w:continuationSeparator/>
+      </w:r>
+    </w:p>
+  </w:endnote>
+</w:endnotes>
 </file>
 
 <file path=word/footer1.xml><?xml version="1.0" encoding="utf-8"?>
@@ -3616,7 +4559,7 @@
       <w:rPr>
         <w:noProof/>
       </w:rPr>
-      <w:t>2</w:t>
+      <w:t>9</w:t>
     </w:r>
     <w:r>
       <w:fldChar w:fldCharType="end"/>
@@ -3629,6 +4572,31 @@
 <w:ftr xmlns:wpc="http://schemas.microsoft.com/office/word/2010/wordprocessingCanvas" xmlns:mc="http://schemas.openxmlformats.org/markup-compatibility/2006" xmlns:o="urn:schemas-microsoft-com:office:office" xmlns:r="http://schemas.openxmlformats.org/officeDocument/2006/relationships" xmlns:m="http://schemas.openxmlformats.org/officeDocument/2006/math" xmlns:v="urn:schemas-microsoft-com:vml" xmlns:wp14="http://schemas.microsoft.com/office/word/2010/wordprocessingDrawing" xmlns:wp="http://schemas.openxmlformats.org/drawingml/2006/wordprocessingDrawing" xmlns:w10="urn:schemas-microsoft-com:office:word" xmlns:w="http://schemas.openxmlformats.org/wordprocessingml/2006/main" xmlns:w14="http://schemas.microsoft.com/office/word/2010/wordml" xmlns:w15="http://schemas.microsoft.com/office/word/2012/wordml" xmlns:wpg="http://schemas.microsoft.com/office/word/2010/wordprocessingGroup" xmlns:wpi="http://schemas.microsoft.com/office/word/2010/wordprocessingInk" xmlns:wne="http://schemas.microsoft.com/office/word/2006/wordml" xmlns:wps="http://schemas.microsoft.com/office/word/2010/wordprocessingShape" mc:Ignorable="w14 w15 wp14">
   <w:p/>
 </w:ftr>
+</file>
+
+<file path=word/footnotes.xml><?xml version="1.0" encoding="utf-8"?>
+<w:footnotes xmlns:wpc="http://schemas.microsoft.com/office/word/2010/wordprocessingCanvas" xmlns:mc="http://schemas.openxmlformats.org/markup-compatibility/2006" xmlns:o="urn:schemas-microsoft-com:office:office" xmlns:r="http://schemas.openxmlformats.org/officeDocument/2006/relationships" xmlns:m="http://schemas.openxmlformats.org/officeDocument/2006/math" xmlns:v="urn:schemas-microsoft-com:vml" xmlns:wp14="http://schemas.microsoft.com/office/word/2010/wordprocessingDrawing" xmlns:wp="http://schemas.openxmlformats.org/drawingml/2006/wordprocessingDrawing" xmlns:w10="urn:schemas-microsoft-com:office:word" xmlns:w="http://schemas.openxmlformats.org/wordprocessingml/2006/main" xmlns:w14="http://schemas.microsoft.com/office/word/2010/wordml" xmlns:w15="http://schemas.microsoft.com/office/word/2012/wordml" xmlns:wpg="http://schemas.microsoft.com/office/word/2010/wordprocessingGroup" xmlns:wpi="http://schemas.microsoft.com/office/word/2010/wordprocessingInk" xmlns:wne="http://schemas.microsoft.com/office/word/2006/wordml" xmlns:wps="http://schemas.microsoft.com/office/word/2010/wordprocessingShape" mc:Ignorable="w14 w15 wp14">
+  <w:footnote w:type="separator" w:id="-1">
+    <w:p>
+      <w:pPr>
+        <w:spacing w:line="240" w:lineRule="auto"/>
+      </w:pPr>
+      <w:r>
+        <w:separator/>
+      </w:r>
+    </w:p>
+  </w:footnote>
+  <w:footnote w:type="continuationSeparator" w:id="0">
+    <w:p>
+      <w:pPr>
+        <w:spacing w:line="240" w:lineRule="auto"/>
+      </w:pPr>
+      <w:r>
+        <w:continuationSeparator/>
+      </w:r>
+    </w:p>
+  </w:footnote>
+</w:footnotes>
 </file>
 
 <file path=word/header1.xml><?xml version="1.0" encoding="utf-8"?>
@@ -4951,6 +5919,7 @@
   <w:style w:type="character" w:default="1" w:styleId="a0">
     <w:name w:val="Default Paragraph Font"/>
     <w:uiPriority w:val="1"/>
+    <w:semiHidden/>
     <w:unhideWhenUsed/>
   </w:style>
   <w:style w:type="table" w:default="1" w:styleId="a1">
@@ -5048,6 +6017,25 @@
     <w:rPr>
       <w:b/>
       <w:bCs/>
+    </w:rPr>
+  </w:style>
+  <w:style w:type="paragraph" w:styleId="a6">
+    <w:name w:val="caption"/>
+    <w:basedOn w:val="a"/>
+    <w:next w:val="a"/>
+    <w:uiPriority w:val="35"/>
+    <w:unhideWhenUsed/>
+    <w:qFormat/>
+    <w:rsid w:val="009E3070"/>
+    <w:pPr>
+      <w:spacing w:after="200" w:line="240" w:lineRule="auto"/>
+    </w:pPr>
+    <w:rPr>
+      <w:i/>
+      <w:iCs/>
+      <w:color w:val="44546A" w:themeColor="text2"/>
+      <w:sz w:val="18"/>
+      <w:szCs w:val="18"/>
     </w:rPr>
   </w:style>
 </w:styles>

</xml_diff>